<commit_message>
Refactor tare weight handling and enhance drying batch functionality
- Updated the schema to integrate tare weight into the gross weight model, removing the separate tare weight stage.
- Modified demo data seeding to reflect the new tare weight structure.
- Enhanced drying batch processing to support sun drying rounds, including quality checks and tracking of input/output metrics.
- Implemented role-based access control for sensitive fields, ensuring that certain roles cannot view or modify price-related data.
- Updated various services and routes to accommodate the new drying process and tare weight integration, improving overall data integrity and user experience.
</commit_message>
<xml_diff>
--- a/Procurement.docx
+++ b/Procurement.docx
@@ -135,7 +135,7 @@
           <w:sz w:val="20"/>
           <w:szCs w:val="20"/>
         </w:rPr>
-        <w:t xml:space="preserve">Version 1 · October 2026</w:t>
+        <w:t xml:space="preserve">Version 1.1 · October 2026</w:t>
       </w:r>
     </w:p>
     <w:p>
@@ -2186,6 +2186,29 @@
               <w:t xml:space="preserve">Records Pass / Fail, finalises bins, runs transfers, uploads workbooks.</w:t>
             </w:r>
           </w:p>
+          <w:p>
+            <w:pPr>
+              <w:spacing w:after="40" w:line="264"/>
+            </w:pPr>
+            <w:r>
+              <w:rPr>
+                <w:b/>
+                <w:bCs/>
+                <w:sz w:val="19"/>
+                <w:szCs w:val="19"/>
+              </w:rPr>
+              <w:t xml:space="preserve">Never sees prices or amounts</w:t>
+            </w:r>
+            <w:r>
+              <w:rPr>
+                <w:b w:val="false"/>
+                <w:bCs w:val="false"/>
+                <w:sz w:val="19"/>
+                <w:szCs w:val="19"/>
+              </w:rPr>
+              <w:t xml:space="preserve">, anywhere in the application or its Excel files.</w:t>
+            </w:r>
+          </w:p>
         </w:tc>
       </w:tr>
       <w:tr>
@@ -2284,7 +2307,30 @@
                 <w:sz w:val="19"/>
                 <w:szCs w:val="19"/>
               </w:rPr>
-              <w:t xml:space="preserve">Submits reception details: vehicle number, supplier, LBA code, fiche, price.</w:t>
+              <w:t xml:space="preserve">Submits reception details: vehicle number, supplier, LBA code, fiche.</w:t>
+            </w:r>
+          </w:p>
+          <w:p>
+            <w:pPr>
+              <w:spacing w:after="40" w:line="264"/>
+            </w:pPr>
+            <w:r>
+              <w:rPr>
+                <w:b/>
+                <w:bCs/>
+                <w:sz w:val="19"/>
+                <w:szCs w:val="19"/>
+              </w:rPr>
+              <w:t xml:space="preserve">Sets the negotiated price directly</w:t>
+            </w:r>
+            <w:r>
+              <w:rPr>
+                <w:b w:val="false"/>
+                <w:bCs w:val="false"/>
+                <w:sz w:val="19"/>
+                <w:szCs w:val="19"/>
+              </w:rPr>
+              <w:t xml:space="preserve"> on the truck, with no approval.</w:t>
             </w:r>
           </w:p>
           <w:p>
@@ -2472,7 +2518,17 @@
         <w:t xml:space="preserve">Approvals</w:t>
       </w:r>
       <w:r>
-        <w:t xml:space="preserve"> screen. Only an approved form changes the truck, and the record keeps who submitted, who approved and when.</w:t>
+        <w:t xml:space="preserve"> screen. Only an approved form changes the truck, and the record keeps who submitted, who approved and when. The one exception is the </w:t>
+      </w:r>
+      <w:r>
+        <w:rPr>
+          <w:b/>
+          <w:bCs/>
+        </w:rPr>
+        <w:t xml:space="preserve">price</w:t>
+      </w:r>
+      <w:r>
+        <w:t xml:space="preserve">: the Branch Manager saves it straight onto the truck, because the Warehouse Incharge who approves forms does not see prices.</w:t>
       </w:r>
     </w:p>
     <w:p>
@@ -2929,7 +2985,7 @@
                 <w:sz w:val="19"/>
                 <w:szCs w:val="19"/>
               </w:rPr>
-              <w:t xml:space="preserve">Let the truck in, check its papers, weigh it and test the nuts; accept or reject.</w:t>
+              <w:t xml:space="preserve">Let the truck in, check its papers, weigh it full and empty and test the nuts; accept or reject.</w:t>
             </w:r>
           </w:p>
         </w:tc>
@@ -3031,7 +3087,7 @@
                 <w:sz w:val="19"/>
                 <w:szCs w:val="19"/>
               </w:rPr>
-              <w:t xml:space="preserve">Unload, count the bags, weigh the empty truck, give the nuts a Lot number and a bin, record the GRN.</w:t>
+              <w:t xml:space="preserve">Unload and count the bags, give the nuts a Lot number and a bin, record the GRN.</w:t>
             </w:r>
           </w:p>
         </w:tc>
@@ -3857,7 +3913,7 @@
           <w:b/>
           <w:bCs/>
         </w:rPr>
-        <w:t xml:space="preserve">16 steps</w:t>
+        <w:t xml:space="preserve">15 steps</w:t>
       </w:r>
       <w:r>
         <w:t xml:space="preserve">. The application shows them on the truck's page as sections that can be filled </w:t>
@@ -3884,7 +3940,7 @@
           <wp:inline distT="0" distB="0" distL="0" distR="0">
             <wp:extent cx="6096000" cy="4019550"/>
             <wp:effectExtent t="0" r="0" b="0" l="0"/>
-            <wp:docPr id="1" name="journey" descr="The 16 steps of one truck, from the gate to the transfer to Yakro." title="The 16 steps of one truck, from the gate to the transfer to Yakro."/>
+            <wp:docPr id="1" name="journey" descr="The 15 steps of one truck, from the gate to the transfer to Yakro." title="The 15 steps of one truck, from the gate to the transfer to Yakro."/>
             <wp:cNvGraphicFramePr>
               <a:graphicFrameLocks xmlns:a="http://schemas.openxmlformats.org/drawingml/2006/main" noChangeAspect="1"/>
             </wp:cNvGraphicFramePr>
@@ -3943,7 +3999,7 @@
           <w:sz w:val="18"/>
           <w:szCs w:val="18"/>
         </w:rPr>
-        <w:t xml:space="preserve">The 16 steps of one truck, from the gate to the transfer to Yakro.</w:t>
+        <w:t xml:space="preserve">The 15 steps of one truck, from the gate to the transfer to Yakro.</w:t>
       </w:r>
     </w:p>
     <w:p>
@@ -4561,7 +4617,7 @@
                 <w:sz w:val="19"/>
                 <w:szCs w:val="19"/>
               </w:rPr>
-              <w:t xml:space="preserve">The loaded truck is weighed. </w:t>
+              <w:t xml:space="preserve">The loaded truck is weighed on arrival and the empty truck (</w:t>
             </w:r>
             <w:r>
               <w:rPr>
@@ -4570,6 +4626,29 @@
                 <w:sz w:val="19"/>
                 <w:szCs w:val="19"/>
               </w:rPr>
+              <w:t xml:space="preserve">tare</w:t>
+            </w:r>
+            <w:r>
+              <w:rPr>
+                <w:b w:val="false"/>
+                <w:bCs w:val="false"/>
+                <w:sz w:val="19"/>
+                <w:szCs w:val="19"/>
+              </w:rPr>
+              <w:t xml:space="preserve">) after unloading; both readings are entered in this one step.</w:t>
+            </w:r>
+          </w:p>
+          <w:p>
+            <w:pPr>
+              <w:spacing w:after="40" w:line="264"/>
+            </w:pPr>
+            <w:r>
+              <w:rPr>
+                <w:b/>
+                <w:bCs/>
+                <w:sz w:val="19"/>
+                <w:szCs w:val="19"/>
+              </w:rPr>
               <w:t xml:space="preserve">Gross weight</w:t>
             </w:r>
             <w:r>
@@ -4579,7 +4658,7 @@
                 <w:sz w:val="19"/>
                 <w:szCs w:val="19"/>
               </w:rPr>
-              <w:t xml:space="preserve"> = loaded truck − empty truck (chapter 8).</w:t>
+              <w:t xml:space="preserve"> = loaded − empty, calculated once both are in, or typed straight from the weighbridge ticket (chapter 8).</w:t>
             </w:r>
           </w:p>
         </w:tc>
@@ -5331,7 +5410,7 @@
                 <w:sz w:val="19"/>
                 <w:szCs w:val="19"/>
               </w:rPr>
-              <w:t xml:space="preserve"> (Sacs déchirés). Date of offloading (filled in by itself), refraction, forklift destination.</w:t>
+              <w:t xml:space="preserve"> (Sacs déchirés). Date of offloading (filled in by itself), refraction, manpower, tally clerk count, pallets.</w:t>
             </w:r>
           </w:p>
           <w:p>
@@ -5457,7 +5536,7 @@
                 <w:sz w:val="19"/>
                 <w:szCs w:val="19"/>
               </w:rPr>
-              <w:t xml:space="preserve">Weigh truck (Empty – Tare weight)</w:t>
+              <w:t xml:space="preserve">Calculate net weight</w:t>
             </w:r>
           </w:p>
         </w:tc>
@@ -5483,15 +5562,6 @@
             <w:pPr>
               <w:spacing w:after="40" w:line="264"/>
             </w:pPr>
-            <w:r>
-              <w:rPr>
-                <w:b w:val="false"/>
-                <w:bCs w:val="false"/>
-                <w:sz w:val="19"/>
-                <w:szCs w:val="19"/>
-              </w:rPr>
-              <w:t xml:space="preserve">The empty truck is weighed again: its </w:t>
-            </w:r>
             <w:r>
               <w:rPr>
                 <w:b/>
@@ -5499,16 +5569,34 @@
                 <w:sz w:val="19"/>
                 <w:szCs w:val="19"/>
               </w:rPr>
-              <w:t xml:space="preserve">tare</w:t>
-            </w:r>
-            <w:r>
-              <w:rPr>
-                <w:b w:val="false"/>
-                <w:bCs w:val="false"/>
-                <w:sz w:val="19"/>
-                <w:szCs w:val="19"/>
-              </w:rPr>
-              <w:t xml:space="preserve">.</w:t>
+              <w:t xml:space="preserve">Net</w:t>
+            </w:r>
+            <w:r>
+              <w:rPr>
+                <w:b w:val="false"/>
+                <w:bCs w:val="false"/>
+                <w:sz w:val="19"/>
+                <w:szCs w:val="19"/>
+              </w:rPr>
+              <w:t xml:space="preserve"> = gross − 1 kg per bag; </w:t>
+            </w:r>
+            <w:r>
+              <w:rPr>
+                <w:b/>
+                <w:bCs/>
+                <w:sz w:val="19"/>
+                <w:szCs w:val="19"/>
+              </w:rPr>
+              <w:t xml:space="preserve">paid weight</w:t>
+            </w:r>
+            <w:r>
+              <w:rPr>
+                <w:b w:val="false"/>
+                <w:bCs w:val="false"/>
+                <w:sz w:val="19"/>
+                <w:szCs w:val="19"/>
+              </w:rPr>
+              <w:t xml:space="preserve"> = net − refraction. Calculated, never typed.</w:t>
             </w:r>
           </w:p>
         </w:tc>
@@ -5541,7 +5629,7 @@
                 <w:sz w:val="19"/>
                 <w:szCs w:val="19"/>
               </w:rPr>
-              <w:t xml:space="preserve">Weighbridge</w:t>
+              <w:t xml:space="preserve">System</w:t>
             </w:r>
           </w:p>
         </w:tc>
@@ -5610,7 +5698,7 @@
                 <w:sz w:val="19"/>
                 <w:szCs w:val="19"/>
               </w:rPr>
-              <w:t xml:space="preserve">Calculate net weight</w:t>
+              <w:t xml:space="preserve">Assign Lot Number to truck</w:t>
             </w:r>
           </w:p>
         </w:tc>
@@ -5635,6 +5723,15 @@
             <w:pPr>
               <w:spacing w:after="40" w:line="264"/>
             </w:pPr>
+            <w:r>
+              <w:rPr>
+                <w:b w:val="false"/>
+                <w:bCs w:val="false"/>
+                <w:sz w:val="19"/>
+                <w:szCs w:val="19"/>
+              </w:rPr>
+              <w:t xml:space="preserve">Issued automatically the moment the truck </w:t>
+            </w:r>
             <w:r>
               <w:rPr>
                 <w:b/>
@@ -5642,34 +5739,16 @@
                 <w:sz w:val="19"/>
                 <w:szCs w:val="19"/>
               </w:rPr>
-              <w:t xml:space="preserve">Net</w:t>
-            </w:r>
-            <w:r>
-              <w:rPr>
-                <w:b w:val="false"/>
-                <w:bCs w:val="false"/>
-                <w:sz w:val="19"/>
-                <w:szCs w:val="19"/>
-              </w:rPr>
-              <w:t xml:space="preserve"> = gross − 1 kg per bag; </w:t>
-            </w:r>
-            <w:r>
-              <w:rPr>
-                <w:b/>
-                <w:bCs/>
-                <w:sz w:val="19"/>
-                <w:szCs w:val="19"/>
-              </w:rPr>
-              <w:t xml:space="preserve">paid weight</w:t>
-            </w:r>
-            <w:r>
-              <w:rPr>
-                <w:b w:val="false"/>
-                <w:bCs w:val="false"/>
-                <w:sz w:val="19"/>
-                <w:szCs w:val="19"/>
-              </w:rPr>
-              <w:t xml:space="preserve"> = net − refraction. Calculated, never typed.</w:t>
+              <w:t xml:space="preserve">passes</w:t>
+            </w:r>
+            <w:r>
+              <w:rPr>
+                <w:b w:val="false"/>
+                <w:bCs w:val="false"/>
+                <w:sz w:val="19"/>
+                <w:szCs w:val="19"/>
+              </w:rPr>
+              <w:t xml:space="preserve"> quality: LOT-BKE-2026-0001.</w:t>
             </w:r>
           </w:p>
         </w:tc>
@@ -5772,7 +5851,7 @@
                 <w:sz w:val="19"/>
                 <w:szCs w:val="19"/>
               </w:rPr>
-              <w:t xml:space="preserve">Assign Lot Number to truck</w:t>
+              <w:t xml:space="preserve">Allocate Bin (physical storage location)</w:t>
             </w:r>
           </w:p>
         </w:tc>
@@ -5805,7 +5884,7 @@
                 <w:sz w:val="19"/>
                 <w:szCs w:val="19"/>
               </w:rPr>
-              <w:t xml:space="preserve">Issued automatically the moment the truck </w:t>
+              <w:t xml:space="preserve">Which bin the nuts go into. </w:t>
             </w:r>
             <w:r>
               <w:rPr>
@@ -5814,16 +5893,16 @@
                 <w:sz w:val="19"/>
                 <w:szCs w:val="19"/>
               </w:rPr>
-              <w:t xml:space="preserve">passes</w:t>
-            </w:r>
-            <w:r>
-              <w:rPr>
-                <w:b w:val="false"/>
-                <w:bCs w:val="false"/>
-                <w:sz w:val="19"/>
-                <w:szCs w:val="19"/>
-              </w:rPr>
-              <w:t xml:space="preserve"> quality: LOT-BKE-2026-0001.</w:t>
+              <w:t xml:space="preserve">Finalise bin allocation</w:t>
+            </w:r>
+            <w:r>
+              <w:rPr>
+                <w:b w:val="false"/>
+                <w:bCs w:val="false"/>
+                <w:sz w:val="19"/>
+                <w:szCs w:val="19"/>
+              </w:rPr>
+              <w:t xml:space="preserve"> stamps the date and who did it, and closes the step.</w:t>
             </w:r>
           </w:p>
         </w:tc>
@@ -5856,7 +5935,7 @@
                 <w:sz w:val="19"/>
                 <w:szCs w:val="19"/>
               </w:rPr>
-              <w:t xml:space="preserve">System</w:t>
+              <w:t xml:space="preserve">Warehouse Incharge</w:t>
             </w:r>
           </w:p>
         </w:tc>
@@ -5925,7 +6004,7 @@
                 <w:sz w:val="19"/>
                 <w:szCs w:val="19"/>
               </w:rPr>
-              <w:t xml:space="preserve">Allocate Bin (physical storage location)</w:t>
+              <w:t xml:space="preserve">Generate RCN reception record (GRN)</w:t>
             </w:r>
           </w:p>
         </w:tc>
@@ -5957,7 +6036,7 @@
                 <w:sz w:val="19"/>
                 <w:szCs w:val="19"/>
               </w:rPr>
-              <w:t xml:space="preserve">Which bin the nuts go into. </w:t>
+              <w:t xml:space="preserve">The </w:t>
             </w:r>
             <w:r>
               <w:rPr>
@@ -5966,16 +6045,48 @@
                 <w:sz w:val="19"/>
                 <w:szCs w:val="19"/>
               </w:rPr>
-              <w:t xml:space="preserve">Finalise bin allocation</w:t>
-            </w:r>
-            <w:r>
-              <w:rPr>
-                <w:b w:val="false"/>
-                <w:bCs w:val="false"/>
-                <w:sz w:val="19"/>
-                <w:szCs w:val="19"/>
-              </w:rPr>
-              <w:t xml:space="preserve"> stamps the date and who did it, and closes the step.</w:t>
+              <w:t xml:space="preserve">GRN quantity</w:t>
+            </w:r>
+            <w:r>
+              <w:rPr>
+                <w:b w:val="false"/>
+                <w:bCs w:val="false"/>
+                <w:sz w:val="19"/>
+                <w:szCs w:val="19"/>
+              </w:rPr>
+              <w:t xml:space="preserve"> (officially taken into stock), recorded by the Warehouse Incharge.</w:t>
+            </w:r>
+          </w:p>
+          <w:p>
+            <w:pPr>
+              <w:spacing w:after="40" w:line="264"/>
+            </w:pPr>
+            <w:r>
+              <w:rPr>
+                <w:b w:val="false"/>
+                <w:bCs w:val="false"/>
+                <w:sz w:val="19"/>
+                <w:szCs w:val="19"/>
+              </w:rPr>
+              <w:t xml:space="preserve">The </w:t>
+            </w:r>
+            <w:r>
+              <w:rPr>
+                <w:b/>
+                <w:bCs/>
+                <w:sz w:val="19"/>
+                <w:szCs w:val="19"/>
+              </w:rPr>
+              <w:t xml:space="preserve">price</w:t>
+            </w:r>
+            <w:r>
+              <w:rPr>
+                <w:b w:val="false"/>
+                <w:bCs w:val="false"/>
+                <w:sz w:val="19"/>
+                <w:szCs w:val="19"/>
+              </w:rPr>
+              <w:t xml:space="preserve">, set directly by the Branch Manager; amount = price × paid weight (calculated). Neither is shown to the Warehouse Incharge.</w:t>
             </w:r>
           </w:p>
         </w:tc>
@@ -6007,7 +6118,7 @@
                 <w:sz w:val="19"/>
                 <w:szCs w:val="19"/>
               </w:rPr>
-              <w:t xml:space="preserve">Warehouse Incharge</w:t>
+              <w:t xml:space="preserve">Warehouse Incharge; price by Branch Manager</w:t>
             </w:r>
           </w:p>
         </w:tc>
@@ -6078,7 +6189,7 @@
                 <w:sz w:val="19"/>
                 <w:szCs w:val="19"/>
               </w:rPr>
-              <w:t xml:space="preserve">Generate RCN reception record (GRN)</w:t>
+              <w:t xml:space="preserve">Update warehouse RCN stock (System)</w:t>
             </w:r>
           </w:p>
         </w:tc>
@@ -6111,43 +6222,7 @@
                 <w:sz w:val="19"/>
                 <w:szCs w:val="19"/>
               </w:rPr>
-              <w:t xml:space="preserve">The </w:t>
-            </w:r>
-            <w:r>
-              <w:rPr>
-                <w:b/>
-                <w:bCs/>
-                <w:sz w:val="19"/>
-                <w:szCs w:val="19"/>
-              </w:rPr>
-              <w:t xml:space="preserve">GRN quantity</w:t>
-            </w:r>
-            <w:r>
-              <w:rPr>
-                <w:b w:val="false"/>
-                <w:bCs w:val="false"/>
-                <w:sz w:val="19"/>
-                <w:szCs w:val="19"/>
-              </w:rPr>
-              <w:t xml:space="preserve"> (officially taken into stock) and the </w:t>
-            </w:r>
-            <w:r>
-              <w:rPr>
-                <w:b/>
-                <w:bCs/>
-                <w:sz w:val="19"/>
-                <w:szCs w:val="19"/>
-              </w:rPr>
-              <w:t xml:space="preserve">price</w:t>
-            </w:r>
-            <w:r>
-              <w:rPr>
-                <w:b w:val="false"/>
-                <w:bCs w:val="false"/>
-                <w:sz w:val="19"/>
-                <w:szCs w:val="19"/>
-              </w:rPr>
-              <w:t xml:space="preserve">. Amount = price × paid weight (calculated).</w:t>
+              <w:t xml:space="preserve">The stock goes up by itself.</w:t>
             </w:r>
           </w:p>
         </w:tc>
@@ -6161,139 +6236,6 @@
               <w:right w:val="single" w:color="D6D3D1" w:sz="4"/>
             </w:tcBorders>
             <w:shd w:fill="F5F5F4" w:color="auto" w:val="clear"/>
-            <w:tcMar>
-              <w:top w:type="dxa" w:w="70"/>
-              <w:left w:type="dxa" w:w="110"/>
-              <w:bottom w:type="dxa" w:w="70"/>
-              <w:right w:type="dxa" w:w="110"/>
-            </w:tcMar>
-            <w:vAlign w:val="top"/>
-          </w:tcPr>
-          <w:p>
-            <w:pPr>
-              <w:spacing w:after="40" w:line="264"/>
-            </w:pPr>
-            <w:r>
-              <w:rPr>
-                <w:b w:val="false"/>
-                <w:bCs w:val="false"/>
-                <w:sz w:val="19"/>
-                <w:szCs w:val="19"/>
-              </w:rPr>
-              <w:t xml:space="preserve">Warehouse Incharge, price by Branch Manager</w:t>
-            </w:r>
-          </w:p>
-        </w:tc>
-      </w:tr>
-      <w:tr>
-        <w:trPr>
-          <w:cantSplit/>
-        </w:trPr>
-        <w:tc>
-          <w:tcPr>
-            <w:tcW w:type="dxa" w:w="589"/>
-            <w:tcBorders>
-              <w:top w:val="single" w:color="D6D3D1" w:sz="4"/>
-              <w:left w:val="single" w:color="D6D3D1" w:sz="4"/>
-              <w:bottom w:val="single" w:color="D6D3D1" w:sz="4"/>
-              <w:right w:val="single" w:color="D6D3D1" w:sz="4"/>
-            </w:tcBorders>
-            <w:tcMar>
-              <w:top w:type="dxa" w:w="70"/>
-              <w:left w:type="dxa" w:w="110"/>
-              <w:bottom w:type="dxa" w:w="70"/>
-              <w:right w:type="dxa" w:w="110"/>
-            </w:tcMar>
-            <w:vAlign w:val="top"/>
-          </w:tcPr>
-          <w:p>
-            <w:pPr>
-              <w:spacing w:after="40" w:line="264"/>
-            </w:pPr>
-            <w:r>
-              <w:rPr>
-                <w:b w:val="false"/>
-                <w:bCs w:val="false"/>
-                <w:sz w:val="19"/>
-                <w:szCs w:val="19"/>
-              </w:rPr>
-              <w:t xml:space="preserve">11</w:t>
-            </w:r>
-          </w:p>
-        </w:tc>
-        <w:tc>
-          <w:tcPr>
-            <w:tcW w:type="dxa" w:w="2410"/>
-            <w:tcBorders>
-              <w:top w:val="single" w:color="D6D3D1" w:sz="4"/>
-              <w:left w:val="single" w:color="D6D3D1" w:sz="4"/>
-              <w:bottom w:val="single" w:color="D6D3D1" w:sz="4"/>
-              <w:right w:val="single" w:color="D6D3D1" w:sz="4"/>
-            </w:tcBorders>
-            <w:tcMar>
-              <w:top w:type="dxa" w:w="70"/>
-              <w:left w:type="dxa" w:w="110"/>
-              <w:bottom w:type="dxa" w:w="70"/>
-              <w:right w:type="dxa" w:w="110"/>
-            </w:tcMar>
-            <w:vAlign w:val="top"/>
-          </w:tcPr>
-          <w:p>
-            <w:pPr>
-              <w:spacing w:after="40" w:line="264"/>
-            </w:pPr>
-            <w:r>
-              <w:rPr>
-                <w:b w:val="false"/>
-                <w:bCs w:val="false"/>
-                <w:sz w:val="19"/>
-                <w:szCs w:val="19"/>
-              </w:rPr>
-              <w:t xml:space="preserve">Update warehouse RCN stock (System)</w:t>
-            </w:r>
-          </w:p>
-        </w:tc>
-        <w:tc>
-          <w:tcPr>
-            <w:tcW w:type="dxa" w:w="4819"/>
-            <w:tcBorders>
-              <w:top w:val="single" w:color="D6D3D1" w:sz="4"/>
-              <w:left w:val="single" w:color="D6D3D1" w:sz="4"/>
-              <w:bottom w:val="single" w:color="D6D3D1" w:sz="4"/>
-              <w:right w:val="single" w:color="D6D3D1" w:sz="4"/>
-            </w:tcBorders>
-            <w:tcMar>
-              <w:top w:type="dxa" w:w="70"/>
-              <w:left w:type="dxa" w:w="110"/>
-              <w:bottom w:type="dxa" w:w="70"/>
-              <w:right w:type="dxa" w:w="110"/>
-            </w:tcMar>
-            <w:vAlign w:val="top"/>
-          </w:tcPr>
-          <w:p>
-            <w:pPr>
-              <w:spacing w:after="40" w:line="264"/>
-            </w:pPr>
-            <w:r>
-              <w:rPr>
-                <w:b w:val="false"/>
-                <w:bCs w:val="false"/>
-                <w:sz w:val="19"/>
-                <w:szCs w:val="19"/>
-              </w:rPr>
-              <w:t xml:space="preserve">The stock goes up by itself.</w:t>
-            </w:r>
-          </w:p>
-        </w:tc>
-        <w:tc>
-          <w:tcPr>
-            <w:tcW w:type="dxa" w:w="1820"/>
-            <w:tcBorders>
-              <w:top w:val="single" w:color="D6D3D1" w:sz="4"/>
-              <w:left w:val="single" w:color="D6D3D1" w:sz="4"/>
-              <w:bottom w:val="single" w:color="D6D3D1" w:sz="4"/>
-              <w:right w:val="single" w:color="D6D3D1" w:sz="4"/>
-            </w:tcBorders>
             <w:tcMar>
               <w:top w:type="dxa" w:w="70"/>
               <w:left w:type="dxa" w:w="110"/>
@@ -6488,7 +6430,7 @@
                 <w:sz w:val="19"/>
                 <w:szCs w:val="19"/>
               </w:rPr>
-              <w:t xml:space="preserve">12</w:t>
+              <w:t xml:space="preserve">11</w:t>
             </w:r>
           </w:p>
         </w:tc>
@@ -6520,7 +6462,7 @@
                 <w:sz w:val="19"/>
                 <w:szCs w:val="19"/>
               </w:rPr>
-              <w:t xml:space="preserve">Does this truck/lot need drying?</w:t>
+              <w:t xml:space="preserve">Sun drying: does this truck/lot need drying?</w:t>
             </w:r>
           </w:p>
         </w:tc>
@@ -6552,7 +6494,7 @@
                 <w:sz w:val="19"/>
                 <w:szCs w:val="19"/>
               </w:rPr>
-              <w:t xml:space="preserve">Yes (direct to the yard, or store first then dry) or No. See chapter 13.</w:t>
+              <w:t xml:space="preserve">Yes (direct to the yard, or store first then dry) or No; drying runs in rounds with a quality check. See chapter 13.</w:t>
             </w:r>
           </w:p>
         </w:tc>
@@ -6590,7 +6532,7 @@
                 <w:sz w:val="19"/>
                 <w:szCs w:val="19"/>
               </w:rPr>
-              <w:t xml:space="preserve">13</w:t>
+              <w:t xml:space="preserve">12</w:t>
             </w:r>
           </w:p>
         </w:tc>
@@ -6693,7 +6635,7 @@
                 <w:sz w:val="19"/>
                 <w:szCs w:val="19"/>
               </w:rPr>
-              <w:t xml:space="preserve">14</w:t>
+              <w:t xml:space="preserve">13</w:t>
             </w:r>
           </w:p>
         </w:tc>
@@ -6795,7 +6737,7 @@
                 <w:sz w:val="19"/>
                 <w:szCs w:val="19"/>
               </w:rPr>
-              <w:t xml:space="preserve">15</w:t>
+              <w:t xml:space="preserve">14</w:t>
             </w:r>
           </w:p>
         </w:tc>
@@ -7363,7 +7305,7 @@
                 <w:sz w:val="19"/>
                 <w:szCs w:val="19"/>
               </w:rPr>
-              <w:t xml:space="preserve">Loaded truck − empty truck (tare), on the weighbridge.</w:t>
+              <w:t xml:space="preserve">Loaded truck − empty truck (tare): both readings are entered in the Weight step. Typed from the weighbridge ticket when the readings aren't.</w:t>
             </w:r>
           </w:p>
         </w:tc>
@@ -7779,7 +7721,17 @@
         <w:t xml:space="preserve">Amount</w:t>
       </w:r>
       <w:r>
-        <w:t xml:space="preserve"> = price per kg × paid weight. The application records it at the GRN step, but money owed, advances and payments are not tracked.</w:t>
+        <w:t xml:space="preserve"> = price per kg × paid weight. The application records it at the GRN step, but money owed, advances and payments are not tracked. </w:t>
+      </w:r>
+      <w:r>
+        <w:rPr>
+          <w:b/>
+          <w:bCs/>
+        </w:rPr>
+        <w:t xml:space="preserve">Price and amount are shown only to the Branch Manager and Admin</w:t>
+      </w:r>
+      <w:r>
+        <w:t xml:space="preserve">, never to the Warehouse Incharge.</w:t>
       </w:r>
     </w:p>
     <w:p>
@@ -9235,7 +9187,7 @@
         <w:t xml:space="preserve">Generate RCN reception record (GRN)</w:t>
       </w:r>
       <w:r>
-        <w:t xml:space="preserve">: the GRN quantity and the price per kg. When the GRN is recorded, the stock goes up by itself.</w:t>
+        <w:t xml:space="preserve">: the GRN quantity (recorded by the Warehouse Incharge) and the price per kg (set by the Branch Manager). When the GRN is recorded, the stock goes up by itself.</w:t>
       </w:r>
     </w:p>
     <w:p>
@@ -9354,7 +9306,7 @@
         <w:t xml:space="preserve">When:</w:t>
       </w:r>
       <w:r>
-        <w:t xml:space="preserve"> as soon as both the GRN quantity and the price are recorded, in any order (different people enter them).</w:t>
+        <w:t xml:space="preserve"> as soon as both the GRN quantity and the price are recorded, in any order: the Warehouse Incharge enters the quantity, the Branch Manager the price. The lock waits for both even though the Incharge never sees the price.</w:t>
       </w:r>
     </w:p>
     <w:p>
@@ -10367,7 +10319,17 @@
         <w:spacing w:after="120" w:line="288"/>
       </w:pPr>
       <w:r>
-        <w:t xml:space="preserve">RCN that is too wet can rot and loses weight as it dries, so wet Lots are dried, usually by spreading them in the sun on the </w:t>
+        <w:t xml:space="preserve">RCN that is too wet can rot and loses weight as it dries, so wet Lots are </w:t>
+      </w:r>
+      <w:r>
+        <w:rPr>
+          <w:b/>
+          <w:bCs/>
+        </w:rPr>
+        <w:t xml:space="preserve">sun-dried</w:t>
+      </w:r>
+      <w:r>
+        <w:t xml:space="preserve">: spread out in the sun on the </w:t>
       </w:r>
       <w:r>
         <w:rPr>
@@ -10384,7 +10346,337 @@
           <w:b/>
           <w:bCs/>
         </w:rPr>
-        <w:t xml:space="preserve">“Does this truck/lot need drying?”</w:t>
+        <w:t xml:space="preserve">“Does this Lot need sun drying?”</w:t>
+      </w:r>
+    </w:p>
+    <w:tbl>
+      <w:tblPr>
+        <w:tblW w:type="dxa" w:w="9638"/>
+        <w:tblBorders>
+          <w:top w:val="single" w:color="auto" w:sz="4"/>
+          <w:left w:val="single" w:color="auto" w:sz="4"/>
+          <w:bottom w:val="single" w:color="auto" w:sz="4"/>
+          <w:right w:val="single" w:color="auto" w:sz="4"/>
+          <w:insideH w:val="single" w:color="auto" w:sz="4"/>
+          <w:insideV w:val="single" w:color="auto" w:sz="4"/>
+        </w:tblBorders>
+      </w:tblPr>
+      <w:tblGrid>
+        <w:gridCol w:w="2784"/>
+        <w:gridCol w:w="6854"/>
+      </w:tblGrid>
+      <w:tr>
+        <w:trPr>
+          <w:tblHeader/>
+        </w:trPr>
+        <w:tc>
+          <w:tcPr>
+            <w:tcW w:type="dxa" w:w="2784"/>
+            <w:tcBorders>
+              <w:top w:val="single" w:color="D6D3D1" w:sz="4"/>
+              <w:left w:val="single" w:color="D6D3D1" w:sz="4"/>
+              <w:bottom w:val="single" w:color="D6D3D1" w:sz="4"/>
+              <w:right w:val="single" w:color="D6D3D1" w:sz="4"/>
+            </w:tcBorders>
+            <w:shd w:fill="9A3412" w:color="auto" w:val="clear"/>
+            <w:tcMar>
+              <w:top w:type="dxa" w:w="70"/>
+              <w:left w:type="dxa" w:w="110"/>
+              <w:bottom w:type="dxa" w:w="70"/>
+              <w:right w:type="dxa" w:w="110"/>
+            </w:tcMar>
+            <w:vAlign w:val="top"/>
+          </w:tcPr>
+          <w:p>
+            <w:pPr>
+              <w:spacing w:after="40" w:line="264"/>
+            </w:pPr>
+            <w:r>
+              <w:rPr>
+                <w:b/>
+                <w:bCs/>
+                <w:color w:val="FFFFFF"/>
+                <w:sz w:val="19"/>
+                <w:szCs w:val="19"/>
+              </w:rPr>
+              <w:t xml:space="preserve">Answer</w:t>
+            </w:r>
+          </w:p>
+        </w:tc>
+        <w:tc>
+          <w:tcPr>
+            <w:tcW w:type="dxa" w:w="6854"/>
+            <w:tcBorders>
+              <w:top w:val="single" w:color="D6D3D1" w:sz="4"/>
+              <w:left w:val="single" w:color="D6D3D1" w:sz="4"/>
+              <w:bottom w:val="single" w:color="D6D3D1" w:sz="4"/>
+              <w:right w:val="single" w:color="D6D3D1" w:sz="4"/>
+            </w:tcBorders>
+            <w:shd w:fill="9A3412" w:color="auto" w:val="clear"/>
+            <w:tcMar>
+              <w:top w:type="dxa" w:w="70"/>
+              <w:left w:type="dxa" w:w="110"/>
+              <w:bottom w:type="dxa" w:w="70"/>
+              <w:right w:type="dxa" w:w="110"/>
+            </w:tcMar>
+            <w:vAlign w:val="top"/>
+          </w:tcPr>
+          <w:p>
+            <w:pPr>
+              <w:spacing w:after="40" w:line="264"/>
+            </w:pPr>
+            <w:r>
+              <w:rPr>
+                <w:b/>
+                <w:bCs/>
+                <w:color w:val="FFFFFF"/>
+                <w:sz w:val="19"/>
+                <w:szCs w:val="19"/>
+              </w:rPr>
+              <w:t xml:space="preserve">Meaning</w:t>
+            </w:r>
+          </w:p>
+        </w:tc>
+      </w:tr>
+      <w:tr>
+        <w:trPr>
+          <w:cantSplit/>
+        </w:trPr>
+        <w:tc>
+          <w:tcPr>
+            <w:tcW w:type="dxa" w:w="2784"/>
+            <w:tcBorders>
+              <w:top w:val="single" w:color="D6D3D1" w:sz="4"/>
+              <w:left w:val="single" w:color="D6D3D1" w:sz="4"/>
+              <w:bottom w:val="single" w:color="D6D3D1" w:sz="4"/>
+              <w:right w:val="single" w:color="D6D3D1" w:sz="4"/>
+            </w:tcBorders>
+            <w:tcMar>
+              <w:top w:type="dxa" w:w="70"/>
+              <w:left w:type="dxa" w:w="110"/>
+              <w:bottom w:type="dxa" w:w="70"/>
+              <w:right w:type="dxa" w:w="110"/>
+            </w:tcMar>
+            <w:vAlign w:val="top"/>
+          </w:tcPr>
+          <w:p>
+            <w:pPr>
+              <w:spacing w:after="40" w:line="264"/>
+            </w:pPr>
+            <w:r>
+              <w:rPr>
+                <w:b/>
+                <w:bCs/>
+                <w:sz w:val="19"/>
+                <w:szCs w:val="19"/>
+              </w:rPr>
+              <w:t xml:space="preserve">No — no drying needed</w:t>
+            </w:r>
+          </w:p>
+        </w:tc>
+        <w:tc>
+          <w:tcPr>
+            <w:tcW w:type="dxa" w:w="6854"/>
+            <w:tcBorders>
+              <w:top w:val="single" w:color="D6D3D1" w:sz="4"/>
+              <w:left w:val="single" w:color="D6D3D1" w:sz="4"/>
+              <w:bottom w:val="single" w:color="D6D3D1" w:sz="4"/>
+              <w:right w:val="single" w:color="D6D3D1" w:sz="4"/>
+            </w:tcBorders>
+            <w:tcMar>
+              <w:top w:type="dxa" w:w="70"/>
+              <w:left w:type="dxa" w:w="110"/>
+              <w:bottom w:type="dxa" w:w="70"/>
+              <w:right w:type="dxa" w:w="110"/>
+            </w:tcMar>
+            <w:vAlign w:val="top"/>
+          </w:tcPr>
+          <w:p>
+            <w:pPr>
+              <w:spacing w:after="40" w:line="264"/>
+            </w:pPr>
+            <w:r>
+              <w:rPr>
+                <w:b w:val="false"/>
+                <w:bCs w:val="false"/>
+                <w:sz w:val="19"/>
+                <w:szCs w:val="19"/>
+              </w:rPr>
+              <w:t xml:space="preserve">Recorded as a decision only; the Lot carries on and its status does not change.</w:t>
+            </w:r>
+          </w:p>
+        </w:tc>
+      </w:tr>
+      <w:tr>
+        <w:trPr>
+          <w:cantSplit/>
+        </w:trPr>
+        <w:tc>
+          <w:tcPr>
+            <w:tcW w:type="dxa" w:w="2784"/>
+            <w:tcBorders>
+              <w:top w:val="single" w:color="D6D3D1" w:sz="4"/>
+              <w:left w:val="single" w:color="D6D3D1" w:sz="4"/>
+              <w:bottom w:val="single" w:color="D6D3D1" w:sz="4"/>
+              <w:right w:val="single" w:color="D6D3D1" w:sz="4"/>
+            </w:tcBorders>
+            <w:shd w:fill="F5F5F4" w:color="auto" w:val="clear"/>
+            <w:tcMar>
+              <w:top w:type="dxa" w:w="70"/>
+              <w:left w:type="dxa" w:w="110"/>
+              <w:bottom w:type="dxa" w:w="70"/>
+              <w:right w:type="dxa" w:w="110"/>
+            </w:tcMar>
+            <w:vAlign w:val="top"/>
+          </w:tcPr>
+          <w:p>
+            <w:pPr>
+              <w:spacing w:after="40" w:line="264"/>
+            </w:pPr>
+            <w:r>
+              <w:rPr>
+                <w:b/>
+                <w:bCs/>
+                <w:sz w:val="19"/>
+                <w:szCs w:val="19"/>
+              </w:rPr>
+              <w:t xml:space="preserve">Direct to drying</w:t>
+            </w:r>
+          </w:p>
+        </w:tc>
+        <w:tc>
+          <w:tcPr>
+            <w:tcW w:type="dxa" w:w="6854"/>
+            <w:tcBorders>
+              <w:top w:val="single" w:color="D6D3D1" w:sz="4"/>
+              <w:left w:val="single" w:color="D6D3D1" w:sz="4"/>
+              <w:bottom w:val="single" w:color="D6D3D1" w:sz="4"/>
+              <w:right w:val="single" w:color="D6D3D1" w:sz="4"/>
+            </w:tcBorders>
+            <w:shd w:fill="F5F5F4" w:color="auto" w:val="clear"/>
+            <w:tcMar>
+              <w:top w:type="dxa" w:w="70"/>
+              <w:left w:type="dxa" w:w="110"/>
+              <w:bottom w:type="dxa" w:w="70"/>
+              <w:right w:type="dxa" w:w="110"/>
+            </w:tcMar>
+            <w:vAlign w:val="top"/>
+          </w:tcPr>
+          <w:p>
+            <w:pPr>
+              <w:spacing w:after="40" w:line="264"/>
+            </w:pPr>
+            <w:r>
+              <w:rPr>
+                <w:b w:val="false"/>
+                <w:bCs w:val="false"/>
+                <w:sz w:val="19"/>
+                <w:szCs w:val="19"/>
+              </w:rPr>
+              <w:t xml:space="preserve">The yard has space: the Lot goes straight there.</w:t>
+            </w:r>
+          </w:p>
+        </w:tc>
+      </w:tr>
+      <w:tr>
+        <w:trPr>
+          <w:cantSplit/>
+        </w:trPr>
+        <w:tc>
+          <w:tcPr>
+            <w:tcW w:type="dxa" w:w="2784"/>
+            <w:tcBorders>
+              <w:top w:val="single" w:color="D6D3D1" w:sz="4"/>
+              <w:left w:val="single" w:color="D6D3D1" w:sz="4"/>
+              <w:bottom w:val="single" w:color="D6D3D1" w:sz="4"/>
+              <w:right w:val="single" w:color="D6D3D1" w:sz="4"/>
+            </w:tcBorders>
+            <w:tcMar>
+              <w:top w:type="dxa" w:w="70"/>
+              <w:left w:type="dxa" w:w="110"/>
+              <w:bottom w:type="dxa" w:w="70"/>
+              <w:right w:type="dxa" w:w="110"/>
+            </w:tcMar>
+            <w:vAlign w:val="top"/>
+          </w:tcPr>
+          <w:p>
+            <w:pPr>
+              <w:spacing w:after="40" w:line="264"/>
+            </w:pPr>
+            <w:r>
+              <w:rPr>
+                <w:b/>
+                <w:bCs/>
+                <w:sz w:val="19"/>
+                <w:szCs w:val="19"/>
+              </w:rPr>
+              <w:t xml:space="preserve">Warehouse → Drying</w:t>
+            </w:r>
+          </w:p>
+        </w:tc>
+        <w:tc>
+          <w:tcPr>
+            <w:tcW w:type="dxa" w:w="6854"/>
+            <w:tcBorders>
+              <w:top w:val="single" w:color="D6D3D1" w:sz="4"/>
+              <w:left w:val="single" w:color="D6D3D1" w:sz="4"/>
+              <w:bottom w:val="single" w:color="D6D3D1" w:sz="4"/>
+              <w:right w:val="single" w:color="D6D3D1" w:sz="4"/>
+            </w:tcBorders>
+            <w:tcMar>
+              <w:top w:type="dxa" w:w="70"/>
+              <w:left w:type="dxa" w:w="110"/>
+              <w:bottom w:type="dxa" w:w="70"/>
+              <w:right w:type="dxa" w:w="110"/>
+            </w:tcMar>
+            <w:vAlign w:val="top"/>
+          </w:tcPr>
+          <w:p>
+            <w:pPr>
+              <w:spacing w:after="40" w:line="264"/>
+            </w:pPr>
+            <w:r>
+              <w:rPr>
+                <w:b w:val="false"/>
+                <w:bCs w:val="false"/>
+                <w:sz w:val="19"/>
+                <w:szCs w:val="19"/>
+              </w:rPr>
+              <w:t xml:space="preserve">The yard is full: the Lot is stored first and issued to drying later.</w:t>
+            </w:r>
+          </w:p>
+        </w:tc>
+      </w:tr>
+    </w:tbl>
+    <w:p>
+      <w:pPr>
+        <w:spacing w:after="120"/>
+      </w:pPr>
+    </w:p>
+    <w:p>
+      <w:pPr>
+        <w:pStyle w:val="Heading2"/>
+      </w:pPr>
+      <w:r>
+        <w:t xml:space="preserve">13.1 Drying in rounds</w:t>
+      </w:r>
+    </w:p>
+    <w:p>
+      <w:pPr>
+        <w:spacing w:after="120" w:line="288"/>
+      </w:pPr>
+      <w:r>
+        <w:t xml:space="preserve">Sun drying happens in </w:t>
+      </w:r>
+      <w:r>
+        <w:rPr>
+          <w:b/>
+          <w:bCs/>
+        </w:rPr>
+        <w:t xml:space="preserve">rounds</w:t>
+      </w:r>
+      <w:r>
+        <w:t xml:space="preserve">. A Lot that is still too wet after one round goes back out for another, starting from what came back. Each round has three moments:</w:t>
       </w:r>
     </w:p>
     <w:p>
@@ -10396,9 +10688,9 @@
       <w:r>
         <w:drawing>
           <wp:inline distT="0" distB="0" distL="0" distR="0">
-            <wp:extent cx="6096000" cy="2266950"/>
+            <wp:extent cx="6096000" cy="2724150"/>
             <wp:effectExtent t="0" r="0" b="0" l="0"/>
-            <wp:docPr id="1" name="drying" descr="The drying decision and the drying record." title="The drying decision and the drying record."/>
+            <wp:docPr id="1" name="drying" descr="Sun drying: a round is issued, comes back, and is checked; a re-dry starts the next round." title="Sun drying: a round is issued, comes back, and is checked; a re-dry starts the next round."/>
             <wp:cNvGraphicFramePr>
               <a:graphicFrameLocks xmlns:a="http://schemas.openxmlformats.org/drawingml/2006/main" noChangeAspect="1"/>
             </wp:cNvGraphicFramePr>
@@ -10421,7 +10713,7 @@
                   <pic:spPr bwMode="auto">
                     <a:xfrm>
                       <a:off x="0" y="0"/>
-                      <a:ext cx="6096000" cy="2266950"/>
+                      <a:ext cx="6096000" cy="2724150"/>
                     </a:xfrm>
                     <a:prstGeom prst="rect">
                       <a:avLst/>
@@ -10457,7 +10749,7 @@
           <w:sz w:val="18"/>
           <w:szCs w:val="18"/>
         </w:rPr>
-        <w:t xml:space="preserve">The drying decision and the drying record.</w:t>
+        <w:t xml:space="preserve">Sun drying: a round is issued, comes back, and is checked; a re-dry starts the next round.</w:t>
       </w:r>
     </w:p>
     <w:tbl>
@@ -10473,8 +10765,9 @@
         </w:tblBorders>
       </w:tblPr>
       <w:tblGrid>
-        <w:gridCol w:w="2784"/>
-        <w:gridCol w:w="6854"/>
+        <w:gridCol w:w="1713"/>
+        <w:gridCol w:w="5783"/>
+        <w:gridCol w:w="2142"/>
       </w:tblGrid>
       <w:tr>
         <w:trPr>
@@ -10482,7 +10775,7 @@
         </w:trPr>
         <w:tc>
           <w:tcPr>
-            <w:tcW w:type="dxa" w:w="2784"/>
+            <w:tcW w:type="dxa" w:w="1713"/>
             <w:tcBorders>
               <w:top w:val="single" w:color="D6D3D1" w:sz="4"/>
               <w:left w:val="single" w:color="D6D3D1" w:sz="4"/>
@@ -10510,13 +10803,13 @@
                 <w:sz w:val="19"/>
                 <w:szCs w:val="19"/>
               </w:rPr>
-              <w:t xml:space="preserve">Answer</w:t>
-            </w:r>
-          </w:p>
-        </w:tc>
-        <w:tc>
-          <w:tcPr>
-            <w:tcW w:type="dxa" w:w="6854"/>
+              <w:t xml:space="preserve">Moment</w:t>
+            </w:r>
+          </w:p>
+        </w:tc>
+        <w:tc>
+          <w:tcPr>
+            <w:tcW w:type="dxa" w:w="5783"/>
             <w:tcBorders>
               <w:top w:val="single" w:color="D6D3D1" w:sz="4"/>
               <w:left w:val="single" w:color="D6D3D1" w:sz="4"/>
@@ -10544,7 +10837,41 @@
                 <w:sz w:val="19"/>
                 <w:szCs w:val="19"/>
               </w:rPr>
-              <w:t xml:space="preserve">Meaning</w:t>
+              <w:t xml:space="preserve">What is recorded</w:t>
+            </w:r>
+          </w:p>
+        </w:tc>
+        <w:tc>
+          <w:tcPr>
+            <w:tcW w:type="dxa" w:w="2142"/>
+            <w:tcBorders>
+              <w:top w:val="single" w:color="D6D3D1" w:sz="4"/>
+              <w:left w:val="single" w:color="D6D3D1" w:sz="4"/>
+              <w:bottom w:val="single" w:color="D6D3D1" w:sz="4"/>
+              <w:right w:val="single" w:color="D6D3D1" w:sz="4"/>
+            </w:tcBorders>
+            <w:shd w:fill="9A3412" w:color="auto" w:val="clear"/>
+            <w:tcMar>
+              <w:top w:type="dxa" w:w="70"/>
+              <w:left w:type="dxa" w:w="110"/>
+              <w:bottom w:type="dxa" w:w="70"/>
+              <w:right w:type="dxa" w:w="110"/>
+            </w:tcMar>
+            <w:vAlign w:val="top"/>
+          </w:tcPr>
+          <w:p>
+            <w:pPr>
+              <w:spacing w:after="40" w:line="264"/>
+            </w:pPr>
+            <w:r>
+              <w:rPr>
+                <w:b/>
+                <w:bCs/>
+                <w:color w:val="FFFFFF"/>
+                <w:sz w:val="19"/>
+                <w:szCs w:val="19"/>
+              </w:rPr>
+              <w:t xml:space="preserve">Round status after it</w:t>
             </w:r>
           </w:p>
         </w:tc>
@@ -10555,7 +10882,7 @@
         </w:trPr>
         <w:tc>
           <w:tcPr>
-            <w:tcW w:type="dxa" w:w="2784"/>
+            <w:tcW w:type="dxa" w:w="1713"/>
             <w:tcBorders>
               <w:top w:val="single" w:color="D6D3D1" w:sz="4"/>
               <w:left w:val="single" w:color="D6D3D1" w:sz="4"/>
@@ -10581,39 +10908,117 @@
                 <w:sz w:val="19"/>
                 <w:szCs w:val="19"/>
               </w:rPr>
-              <w:t xml:space="preserve">No — no drying needed</w:t>
-            </w:r>
-          </w:p>
-        </w:tc>
-        <w:tc>
-          <w:tcPr>
-            <w:tcW w:type="dxa" w:w="6854"/>
-            <w:tcBorders>
-              <w:top w:val="single" w:color="D6D3D1" w:sz="4"/>
-              <w:left w:val="single" w:color="D6D3D1" w:sz="4"/>
-              <w:bottom w:val="single" w:color="D6D3D1" w:sz="4"/>
-              <w:right w:val="single" w:color="D6D3D1" w:sz="4"/>
-            </w:tcBorders>
-            <w:tcMar>
-              <w:top w:type="dxa" w:w="70"/>
-              <w:left w:type="dxa" w:w="110"/>
-              <w:bottom w:type="dxa" w:w="70"/>
-              <w:right w:type="dxa" w:w="110"/>
-            </w:tcMar>
-            <w:vAlign w:val="top"/>
-          </w:tcPr>
-          <w:p>
-            <w:pPr>
-              <w:spacing w:after="40" w:line="264"/>
-            </w:pPr>
-            <w:r>
-              <w:rPr>
-                <w:b w:val="false"/>
-                <w:bCs w:val="false"/>
-                <w:sz w:val="19"/>
-                <w:szCs w:val="19"/>
-              </w:rPr>
-              <w:t xml:space="preserve">Recorded as a decision only; the Lot carries on and its status does not change.</w:t>
+              <w:t xml:space="preserve">1. Issue</w:t>
+            </w:r>
+          </w:p>
+        </w:tc>
+        <w:tc>
+          <w:tcPr>
+            <w:tcW w:type="dxa" w:w="5783"/>
+            <w:tcBorders>
+              <w:top w:val="single" w:color="D6D3D1" w:sz="4"/>
+              <w:left w:val="single" w:color="D6D3D1" w:sz="4"/>
+              <w:bottom w:val="single" w:color="D6D3D1" w:sz="4"/>
+              <w:right w:val="single" w:color="D6D3D1" w:sz="4"/>
+            </w:tcBorders>
+            <w:tcMar>
+              <w:top w:type="dxa" w:w="70"/>
+              <w:left w:type="dxa" w:w="110"/>
+              <w:bottom w:type="dxa" w:w="70"/>
+              <w:right w:type="dxa" w:w="110"/>
+            </w:tcMar>
+            <w:vAlign w:val="top"/>
+          </w:tcPr>
+          <w:p>
+            <w:pPr>
+              <w:spacing w:after="40" w:line="264"/>
+            </w:pPr>
+            <w:r>
+              <w:rPr>
+                <w:b w:val="false"/>
+                <w:bCs w:val="false"/>
+                <w:sz w:val="19"/>
+                <w:szCs w:val="19"/>
+              </w:rPr>
+              <w:t xml:space="preserve">Date, how it goes (direct / via the warehouse), drying type, source and destination bin.</w:t>
+            </w:r>
+          </w:p>
+          <w:p>
+            <w:pPr>
+              <w:spacing w:after="40" w:line="264"/>
+            </w:pPr>
+            <w:r>
+              <w:rPr>
+                <w:b/>
+                <w:bCs/>
+                <w:sz w:val="19"/>
+                <w:szCs w:val="19"/>
+              </w:rPr>
+              <w:t xml:space="preserve">Weight before drying</w:t>
+            </w:r>
+            <w:r>
+              <w:rPr>
+                <w:b w:val="false"/>
+                <w:bCs w:val="false"/>
+                <w:sz w:val="19"/>
+                <w:szCs w:val="19"/>
+              </w:rPr>
+              <w:t xml:space="preserve">: net kg and bags issued.</w:t>
+            </w:r>
+          </w:p>
+          <w:p>
+            <w:pPr>
+              <w:spacing w:after="40" w:line="264"/>
+            </w:pPr>
+            <w:r>
+              <w:rPr>
+                <w:b/>
+                <w:bCs/>
+                <w:sz w:val="19"/>
+                <w:szCs w:val="19"/>
+              </w:rPr>
+              <w:t xml:space="preserve">Quality before drying</w:t>
+            </w:r>
+            <w:r>
+              <w:rPr>
+                <w:b w:val="false"/>
+                <w:bCs w:val="false"/>
+                <w:sz w:val="19"/>
+                <w:szCs w:val="19"/>
+              </w:rPr>
+              <w:t xml:space="preserve">: moisture (required), nut count, cut-test grams; KOR is calculated from the grams.</w:t>
+            </w:r>
+          </w:p>
+        </w:tc>
+        <w:tc>
+          <w:tcPr>
+            <w:tcW w:type="dxa" w:w="2142"/>
+            <w:tcBorders>
+              <w:top w:val="single" w:color="D6D3D1" w:sz="4"/>
+              <w:left w:val="single" w:color="D6D3D1" w:sz="4"/>
+              <w:bottom w:val="single" w:color="D6D3D1" w:sz="4"/>
+              <w:right w:val="single" w:color="D6D3D1" w:sz="4"/>
+            </w:tcBorders>
+            <w:tcMar>
+              <w:top w:type="dxa" w:w="70"/>
+              <w:left w:type="dxa" w:w="110"/>
+              <w:bottom w:type="dxa" w:w="70"/>
+              <w:right w:type="dxa" w:w="110"/>
+            </w:tcMar>
+            <w:vAlign w:val="top"/>
+          </w:tcPr>
+          <w:p>
+            <w:pPr>
+              <w:spacing w:after="40" w:line="264"/>
+            </w:pPr>
+            <w:r>
+              <w:rPr>
+                <w:b w:val="false"/>
+                <w:bCs w:val="false"/>
+                <w:sz w:val="19"/>
+                <w:szCs w:val="19"/>
+              </w:rPr>
+              <w:t xml:space="preserve">In drying</w:t>
             </w:r>
           </w:p>
         </w:tc>
@@ -10624,7 +11029,7 @@
         </w:trPr>
         <w:tc>
           <w:tcPr>
-            <w:tcW w:type="dxa" w:w="2784"/>
+            <w:tcW w:type="dxa" w:w="1713"/>
             <w:tcBorders>
               <w:top w:val="single" w:color="D6D3D1" w:sz="4"/>
               <w:left w:val="single" w:color="D6D3D1" w:sz="4"/>
@@ -10651,13 +11056,13 @@
                 <w:sz w:val="19"/>
                 <w:szCs w:val="19"/>
               </w:rPr>
-              <w:t xml:space="preserve">Direct to drying</w:t>
-            </w:r>
-          </w:p>
-        </w:tc>
-        <w:tc>
-          <w:tcPr>
-            <w:tcW w:type="dxa" w:w="6854"/>
+              <w:t xml:space="preserve">2. What came back</w:t>
+            </w:r>
+          </w:p>
+        </w:tc>
+        <w:tc>
+          <w:tcPr>
+            <w:tcW w:type="dxa" w:w="5783"/>
             <w:tcBorders>
               <w:top w:val="single" w:color="D6D3D1" w:sz="4"/>
               <w:left w:val="single" w:color="D6D3D1" w:sz="4"/>
@@ -10679,12 +11084,54 @@
             </w:pPr>
             <w:r>
               <w:rPr>
-                <w:b w:val="false"/>
-                <w:bCs w:val="false"/>
-                <w:sz w:val="19"/>
-                <w:szCs w:val="19"/>
-              </w:rPr>
-              <w:t xml:space="preserve">The yard has space: the Lot goes straight there.</w:t>
+                <w:b/>
+                <w:bCs/>
+                <w:sz w:val="19"/>
+                <w:szCs w:val="19"/>
+              </w:rPr>
+              <w:t xml:space="preserve">Weight after drying</w:t>
+            </w:r>
+            <w:r>
+              <w:rPr>
+                <w:b w:val="false"/>
+                <w:bCs w:val="false"/>
+                <w:sz w:val="19"/>
+                <w:szCs w:val="19"/>
+              </w:rPr>
+              <w:t xml:space="preserve">: net kg and bags returned. The weight loss (kg and %) is calculated.</w:t>
+            </w:r>
+          </w:p>
+        </w:tc>
+        <w:tc>
+          <w:tcPr>
+            <w:tcW w:type="dxa" w:w="2142"/>
+            <w:tcBorders>
+              <w:top w:val="single" w:color="D6D3D1" w:sz="4"/>
+              <w:left w:val="single" w:color="D6D3D1" w:sz="4"/>
+              <w:bottom w:val="single" w:color="D6D3D1" w:sz="4"/>
+              <w:right w:val="single" w:color="D6D3D1" w:sz="4"/>
+            </w:tcBorders>
+            <w:shd w:fill="F5F5F4" w:color="auto" w:val="clear"/>
+            <w:tcMar>
+              <w:top w:type="dxa" w:w="70"/>
+              <w:left w:type="dxa" w:w="110"/>
+              <w:bottom w:type="dxa" w:w="70"/>
+              <w:right w:type="dxa" w:w="110"/>
+            </w:tcMar>
+            <w:vAlign w:val="top"/>
+          </w:tcPr>
+          <w:p>
+            <w:pPr>
+              <w:spacing w:after="40" w:line="264"/>
+            </w:pPr>
+            <w:r>
+              <w:rPr>
+                <w:b w:val="false"/>
+                <w:bCs w:val="false"/>
+                <w:sz w:val="19"/>
+                <w:szCs w:val="19"/>
+              </w:rPr>
+              <w:t xml:space="preserve">Awaiting quality check</w:t>
             </w:r>
           </w:p>
         </w:tc>
@@ -10695,7 +11142,7 @@
         </w:trPr>
         <w:tc>
           <w:tcPr>
-            <w:tcW w:type="dxa" w:w="2784"/>
+            <w:tcW w:type="dxa" w:w="1713"/>
             <w:tcBorders>
               <w:top w:val="single" w:color="D6D3D1" w:sz="4"/>
               <w:left w:val="single" w:color="D6D3D1" w:sz="4"/>
@@ -10721,39 +11168,130 @@
                 <w:sz w:val="19"/>
                 <w:szCs w:val="19"/>
               </w:rPr>
-              <w:t xml:space="preserve">Warehouse → Drying</w:t>
-            </w:r>
-          </w:p>
-        </w:tc>
-        <w:tc>
-          <w:tcPr>
-            <w:tcW w:type="dxa" w:w="6854"/>
-            <w:tcBorders>
-              <w:top w:val="single" w:color="D6D3D1" w:sz="4"/>
-              <w:left w:val="single" w:color="D6D3D1" w:sz="4"/>
-              <w:bottom w:val="single" w:color="D6D3D1" w:sz="4"/>
-              <w:right w:val="single" w:color="D6D3D1" w:sz="4"/>
-            </w:tcBorders>
-            <w:tcMar>
-              <w:top w:type="dxa" w:w="70"/>
-              <w:left w:type="dxa" w:w="110"/>
-              <w:bottom w:type="dxa" w:w="70"/>
-              <w:right w:type="dxa" w:w="110"/>
-            </w:tcMar>
-            <w:vAlign w:val="top"/>
-          </w:tcPr>
-          <w:p>
-            <w:pPr>
-              <w:spacing w:after="40" w:line="264"/>
-            </w:pPr>
-            <w:r>
-              <w:rPr>
-                <w:b w:val="false"/>
-                <w:bCs w:val="false"/>
-                <w:sz w:val="19"/>
-                <w:szCs w:val="19"/>
-              </w:rPr>
-              <w:t xml:space="preserve">The yard is full: the Lot is stored first and issued to drying later.</w:t>
+              <w:t xml:space="preserve">3. Quality check</w:t>
+            </w:r>
+          </w:p>
+        </w:tc>
+        <w:tc>
+          <w:tcPr>
+            <w:tcW w:type="dxa" w:w="5783"/>
+            <w:tcBorders>
+              <w:top w:val="single" w:color="D6D3D1" w:sz="4"/>
+              <w:left w:val="single" w:color="D6D3D1" w:sz="4"/>
+              <w:bottom w:val="single" w:color="D6D3D1" w:sz="4"/>
+              <w:right w:val="single" w:color="D6D3D1" w:sz="4"/>
+            </w:tcBorders>
+            <w:tcMar>
+              <w:top w:type="dxa" w:w="70"/>
+              <w:left w:type="dxa" w:w="110"/>
+              <w:bottom w:type="dxa" w:w="70"/>
+              <w:right w:type="dxa" w:w="110"/>
+            </w:tcMar>
+            <w:vAlign w:val="top"/>
+          </w:tcPr>
+          <w:p>
+            <w:pPr>
+              <w:spacing w:after="40" w:line="264"/>
+            </w:pPr>
+            <w:r>
+              <w:rPr>
+                <w:b/>
+                <w:bCs/>
+                <w:sz w:val="19"/>
+                <w:szCs w:val="19"/>
+              </w:rPr>
+              <w:t xml:space="preserve">Quality after drying</w:t>
+            </w:r>
+            <w:r>
+              <w:rPr>
+                <w:b w:val="false"/>
+                <w:bCs w:val="false"/>
+                <w:sz w:val="19"/>
+                <w:szCs w:val="19"/>
+              </w:rPr>
+              <w:t xml:space="preserve">: moisture (required), nut count, cut test, KOR.</w:t>
+            </w:r>
+          </w:p>
+          <w:p>
+            <w:pPr>
+              <w:spacing w:after="40" w:line="264"/>
+            </w:pPr>
+            <w:r>
+              <w:rPr>
+                <w:b w:val="false"/>
+                <w:bCs w:val="false"/>
+                <w:sz w:val="19"/>
+                <w:szCs w:val="19"/>
+              </w:rPr>
+              <w:t xml:space="preserve">The result: </w:t>
+            </w:r>
+            <w:r>
+              <w:rPr>
+                <w:b/>
+                <w:bCs/>
+                <w:sz w:val="19"/>
+                <w:szCs w:val="19"/>
+              </w:rPr>
+              <w:t xml:space="preserve">Passed</w:t>
+            </w:r>
+            <w:r>
+              <w:rPr>
+                <w:b w:val="false"/>
+                <w:bCs w:val="false"/>
+                <w:sz w:val="19"/>
+                <w:szCs w:val="19"/>
+              </w:rPr>
+              <w:t xml:space="preserve">, or </w:t>
+            </w:r>
+            <w:r>
+              <w:rPr>
+                <w:b/>
+                <w:bCs/>
+                <w:sz w:val="19"/>
+                <w:szCs w:val="19"/>
+              </w:rPr>
+              <w:t xml:space="preserve">Dry it again</w:t>
+            </w:r>
+            <w:r>
+              <w:rPr>
+                <w:b w:val="false"/>
+                <w:bCs w:val="false"/>
+                <w:sz w:val="19"/>
+                <w:szCs w:val="19"/>
+              </w:rPr>
+              <w:t xml:space="preserve">.</w:t>
+            </w:r>
+          </w:p>
+        </w:tc>
+        <w:tc>
+          <w:tcPr>
+            <w:tcW w:type="dxa" w:w="2142"/>
+            <w:tcBorders>
+              <w:top w:val="single" w:color="D6D3D1" w:sz="4"/>
+              <w:left w:val="single" w:color="D6D3D1" w:sz="4"/>
+              <w:bottom w:val="single" w:color="D6D3D1" w:sz="4"/>
+              <w:right w:val="single" w:color="D6D3D1" w:sz="4"/>
+            </w:tcBorders>
+            <w:tcMar>
+              <w:top w:type="dxa" w:w="70"/>
+              <w:left w:type="dxa" w:w="110"/>
+              <w:bottom w:type="dxa" w:w="70"/>
+              <w:right w:type="dxa" w:w="110"/>
+            </w:tcMar>
+            <w:vAlign w:val="top"/>
+          </w:tcPr>
+          <w:p>
+            <w:pPr>
+              <w:spacing w:after="40" w:line="264"/>
+            </w:pPr>
+            <w:r>
+              <w:rPr>
+                <w:b w:val="false"/>
+                <w:bCs w:val="false"/>
+                <w:sz w:val="19"/>
+                <w:szCs w:val="19"/>
+              </w:rPr>
+              <w:t xml:space="preserve">Passed, or Sent for re-drying</w:t>
             </w:r>
           </w:p>
         </w:tc>
@@ -10763,44 +11301,6 @@
       <w:pPr>
         <w:spacing w:after="120"/>
       </w:pPr>
-    </w:p>
-    <w:p>
-      <w:pPr>
-        <w:spacing w:after="120" w:line="288"/>
-      </w:pPr>
-      <w:r>
-        <w:t xml:space="preserve">Answering </w:t>
-      </w:r>
-      <w:r>
-        <w:rPr>
-          <w:b/>
-          <w:bCs/>
-        </w:rPr>
-        <w:t xml:space="preserve">yes</w:t>
-      </w:r>
-      <w:r>
-        <w:t xml:space="preserve"> opens the drying form (</w:t>
-      </w:r>
-      <w:r>
-        <w:rPr>
-          <w:b/>
-          <w:bCs/>
-        </w:rPr>
-        <w:t xml:space="preserve">Drying details</w:t>
-      </w:r>
-      <w:r>
-        <w:t xml:space="preserve">). When drying starts: date, source and destination bin, drying type (for example SUN DRYING), bags and kg issued, moisture and KOR before. When it ends (</w:t>
-      </w:r>
-      <w:r>
-        <w:rPr>
-          <w:b/>
-          <w:bCs/>
-        </w:rPr>
-        <w:t xml:space="preserve">Complete drying</w:t>
-      </w:r>
-      <w:r>
-        <w:t xml:space="preserve">): bags and kg returned, moisture and KOR after. The application then calculates:</w:t>
-      </w:r>
     </w:p>
     <w:p>
       <w:pPr>
@@ -10816,20 +11316,10 @@
           <w:b/>
           <w:bCs/>
         </w:rPr>
-        <w:t xml:space="preserve">Drying loss (kg)</w:t>
-      </w:r>
-      <w:r>
-        <w:t xml:space="preserve"> = kg issued − kg returned; </w:t>
-      </w:r>
-      <w:r>
-        <w:rPr>
-          <w:b/>
-          <w:bCs/>
-        </w:rPr>
-        <w:t xml:space="preserve">loss %</w:t>
-      </w:r>
-      <w:r>
-        <w:t xml:space="preserve"> = loss ÷ kg issued.</w:t>
+        <w:t xml:space="preserve">Dry it again</w:t>
+      </w:r>
+      <w:r>
+        <w:t xml:space="preserve"> closes the round and immediately opens the next one (round 2, 3 …) with the weight that came back as its weight before drying, and the quality just measured as its quality before drying.</w:t>
       </w:r>
     </w:p>
     <w:p>
@@ -10846,10 +11336,10 @@
           <w:b/>
           <w:bCs/>
         </w:rPr>
-        <w:t xml:space="preserve">Moisture loss</w:t>
-      </w:r>
-      <w:r>
-        <w:t xml:space="preserve"> = moisture before − moisture after, in percentage points.</w:t>
+        <w:t xml:space="preserve">Passed</w:t>
+      </w:r>
+      <w:r>
+        <w:t xml:space="preserve"> finishes the drying. A Lot can still be dried again later; that starts a new round 1.</w:t>
       </w:r>
     </w:p>
     <w:p>
@@ -10862,15 +11352,138 @@
         <w:spacing w:after="60" w:line="276"/>
       </w:pPr>
       <w:r>
-        <w:t xml:space="preserve">The kg returned can never be more than the kg issued; the form refuses it.</w:t>
-      </w:r>
+        <w:t xml:space="preserve">Calculated, never typed: weight loss (kg and %), moisture points removed, and KOR wherever the cut-test grams are recorded.</w:t>
+      </w:r>
+    </w:p>
+    <w:p>
+      <w:pPr>
+        <w:pStyle w:val="ListParagraph"/>
+        <w:numPr>
+          <w:ilvl w:val="0"/>
+          <w:numId w:val="2"/>
+        </w:numPr>
+        <w:spacing w:after="60" w:line="276"/>
+      </w:pPr>
+      <w:r>
+        <w:t xml:space="preserve">The kg returned can never be more than the kg issued, and moisture must be between 0 and 100 %.</w:t>
+      </w:r>
+    </w:p>
+    <w:p>
+      <w:pPr>
+        <w:pStyle w:val="ListParagraph"/>
+        <w:numPr>
+          <w:ilvl w:val="0"/>
+          <w:numId w:val="2"/>
+        </w:numPr>
+        <w:spacing w:after="60" w:line="276"/>
+      </w:pPr>
+      <w:r>
+        <w:t xml:space="preserve">Only one round per Lot can be open at a time. Drying is always per </w:t>
+      </w:r>
+      <w:r>
+        <w:rPr>
+          <w:b/>
+          <w:bCs/>
+        </w:rPr>
+        <w:t xml:space="preserve">Lot</w:t>
+      </w:r>
+      <w:r>
+        <w:t xml:space="preserve">, never per bin.</w:t>
+      </w:r>
+    </w:p>
+    <w:tbl>
+      <w:tblPr>
+        <w:tblW w:type="dxa" w:w="9638"/>
+        <w:tblBorders>
+          <w:top w:val="single" w:color="auto" w:sz="4"/>
+          <w:left w:val="single" w:color="auto" w:sz="4"/>
+          <w:bottom w:val="single" w:color="auto" w:sz="4"/>
+          <w:right w:val="single" w:color="auto" w:sz="4"/>
+          <w:insideH w:val="single" w:color="auto" w:sz="4"/>
+          <w:insideV w:val="single" w:color="auto" w:sz="4"/>
+        </w:tblBorders>
+      </w:tblPr>
+      <w:tblGrid>
+        <w:gridCol w:w="9638"/>
+      </w:tblGrid>
+      <w:tr>
+        <w:trPr>
+          <w:cantSplit/>
+        </w:trPr>
+        <w:tc>
+          <w:tcPr>
+            <w:tcW w:type="dxa" w:w="9638"/>
+            <w:tcBorders>
+              <w:top w:val="none" w:color="FFFFFF" w:sz="0"/>
+              <w:left w:val="single" w:color="9A3412" w:sz="36"/>
+              <w:bottom w:val="none" w:color="FFFFFF" w:sz="0"/>
+              <w:right w:val="none" w:color="FFFFFF" w:sz="0"/>
+            </w:tcBorders>
+            <w:shd w:fill="FFF7ED" w:color="auto" w:val="clear"/>
+            <w:tcMar>
+              <w:top w:type="dxa" w:w="120"/>
+              <w:left w:type="dxa" w:w="200"/>
+              <w:bottom w:type="dxa" w:w="120"/>
+              <w:right w:type="dxa" w:w="200"/>
+            </w:tcMar>
+          </w:tcPr>
+          <w:p>
+            <w:pPr>
+              <w:spacing w:after="60"/>
+            </w:pPr>
+            <w:r>
+              <w:rPr>
+                <w:b/>
+                <w:bCs/>
+                <w:color w:val="9A3412"/>
+                <w:sz w:val="21"/>
+                <w:szCs w:val="21"/>
+              </w:rPr>
+              <w:t xml:space="preserve">The QFS sample stays separate</w:t>
+            </w:r>
+          </w:p>
+          <w:p>
+            <w:pPr>
+              <w:spacing w:after="50" w:line="276"/>
+            </w:pPr>
+            <w:r>
+              <w:rPr>
+                <w:sz w:val="20"/>
+                <w:szCs w:val="20"/>
+              </w:rPr>
+              <w:t xml:space="preserve">The quality measured at reception (the </w:t>
+            </w:r>
+            <w:r>
+              <w:rPr>
+                <w:b/>
+                <w:bCs/>
+                <w:sz w:val="20"/>
+                <w:szCs w:val="20"/>
+              </w:rPr>
+              <w:t xml:space="preserve">QFS</w:t>
+            </w:r>
+            <w:r>
+              <w:rPr>
+                <w:sz w:val="20"/>
+                <w:szCs w:val="20"/>
+              </w:rPr>
+              <w:t xml:space="preserve"> sample, chapter 9) is never copied into or changed by drying. Before and after each round, the quality is measured again on the drying sample, so the two can be compared.</w:t>
+            </w:r>
+          </w:p>
+        </w:tc>
+      </w:tr>
+    </w:tbl>
+    <w:p>
+      <w:pPr>
+        <w:spacing w:after="160"/>
+      </w:pPr>
     </w:p>
     <w:p>
       <w:pPr>
         <w:spacing w:after="120" w:line="288"/>
       </w:pPr>
       <w:r>
-        <w:t xml:space="preserve">The </w:t>
+        <w:t xml:space="preserve">Each round is shown on the truck's page with its status, weights, quality before and after, and who issued, received and checked it. The </w:t>
       </w:r>
       <w:r>
         <w:rPr>
@@ -10880,7 +11493,7 @@
         <w:t xml:space="preserve">Drying</w:t>
       </w:r>
       <w:r>
-        <w:t xml:space="preserve"> screen lists every drying batch of the site, including those imported from the client's drying workbooks.</w:t>
+        <w:t xml:space="preserve"> screen lists every round of the site (with its round number and moisture before → after), together with the batches imported from the client's drying workbooks.</w:t>
       </w:r>
     </w:p>
     <w:p>
@@ -12768,7 +13381,7 @@
         <w:t xml:space="preserve">Export</w:t>
       </w:r>
       <w:r>
-        <w:t xml:space="preserve"> on Reception downloads the site's data in the same workbook layout, optionally for a date range.</w:t>
+        <w:t xml:space="preserve"> on Reception downloads the site's data in the same workbook layout, optionally for a date range. For the Warehouse Incharge the price and amount columns are left out, and if a file with those columns is uploaded by the Incharge they are ignored (and the upload says so).</w:t>
       </w:r>
     </w:p>
     <w:p>
@@ -14913,6 +15526,46 @@
     </w:p>
     <w:p>
       <w:pPr>
+        <w:pStyle w:val="ListParagraph"/>
+        <w:numPr>
+          <w:ilvl w:val="0"/>
+          <w:numId w:val="4"/>
+        </w:numPr>
+        <w:spacing w:after="60" w:line="276"/>
+      </w:pPr>
+      <w:r>
+        <w:rPr>
+          <w:b/>
+          <w:bCs/>
+        </w:rPr>
+        <w:t xml:space="preserve">Price and amount are for the Branch Manager and Admin only</w:t>
+      </w:r>
+      <w:r>
+        <w:t xml:space="preserve">; the Warehouse Incharge never sees them.</w:t>
+      </w:r>
+    </w:p>
+    <w:p>
+      <w:pPr>
+        <w:pStyle w:val="ListParagraph"/>
+        <w:numPr>
+          <w:ilvl w:val="0"/>
+          <w:numId w:val="4"/>
+        </w:numPr>
+        <w:spacing w:after="60" w:line="276"/>
+      </w:pPr>
+      <w:r>
+        <w:rPr>
+          <w:b/>
+          <w:bCs/>
+        </w:rPr>
+        <w:t xml:space="preserve">The QFS sample is never overwritten</w:t>
+      </w:r>
+      <w:r>
+        <w:t xml:space="preserve">; drying measures its own quality before and after.</w:t>
+      </w:r>
+    </w:p>
+    <w:p>
+      <w:pPr>
         <w:pStyle w:val="Heading1"/>
         <w:pageBreakBefore/>
       </w:pPr>
@@ -15035,7 +15688,7 @@
         <w:t xml:space="preserve">Weighbridge.</w:t>
       </w:r>
       <w:r>
-        <w:t xml:space="preserve"> Loaded and empty readings give a gross weight of </w:t>
+        <w:t xml:space="preserve"> The loaded reading on arrival and the empty reading after unloading, both entered in the Weight step, give a gross weight of </w:t>
       </w:r>
       <w:r>
         <w:rPr>
@@ -15215,7 +15868,7 @@
         <w:t xml:space="preserve">GRN.</w:t>
       </w:r>
       <w:r>
-        <w:t xml:space="preserve"> The GRN quantity and the price (470 XOF/kg) are recorded. Status: </w:t>
+        <w:t xml:space="preserve"> The Branch Manager saves the price (470 XOF/kg) directly; the Warehouse Incharge, who never sees it, records the GRN quantity. Status: </w:t>
       </w:r>
       <w:r>
         <w:rPr>
@@ -15767,7 +16420,7 @@
                 <w:sz w:val="19"/>
                 <w:szCs w:val="19"/>
               </w:rPr>
-              <w:t xml:space="preserve">Price per kg × paid weight, recorded at the GRN step (money is not otherwise tracked).</w:t>
+              <w:t xml:space="preserve">Price per kg × paid weight, recorded at the GRN step. Shown to the Branch Manager and Admin only.</w:t>
             </w:r>
           </w:p>
         </w:tc>
@@ -16047,7 +16700,7 @@
                 <w:sz w:val="19"/>
                 <w:szCs w:val="19"/>
               </w:rPr>
-              <w:t xml:space="preserve">Role that submits reception details: truck, supplier, LBA code, fiche, price.</w:t>
+              <w:t xml:space="preserve">Role that submits reception details (truck, supplier, LBA code, fiche) and sets the price directly.</w:t>
             </w:r>
           </w:p>
         </w:tc>
@@ -16714,7 +17367,7 @@
                 <w:sz w:val="19"/>
                 <w:szCs w:val="19"/>
               </w:rPr>
-              <w:t xml:space="preserve">Drying / drying yard</w:t>
+              <w:t xml:space="preserve">Drying / sun drying / drying yard</w:t>
             </w:r>
           </w:p>
         </w:tc>
@@ -16747,7 +17400,7 @@
                 <w:sz w:val="19"/>
                 <w:szCs w:val="19"/>
               </w:rPr>
-              <w:t xml:space="preserve">Removing moisture from wet RCN, usually in the sun on the yard (chapter 13).</w:t>
+              <w:t xml:space="preserve">Removing moisture from wet RCN in the sun on the yard, in rounds (chapter 13).</w:t>
             </w:r>
           </w:p>
         </w:tc>
@@ -19024,7 +19677,7 @@
                 <w:sz w:val="19"/>
                 <w:szCs w:val="19"/>
               </w:rPr>
-              <w:t xml:space="preserve">Refraction</w:t>
+              <w:t xml:space="preserve">Re-dry</w:t>
             </w:r>
           </w:p>
         </w:tc>
@@ -19056,7 +19709,7 @@
                 <w:sz w:val="19"/>
                 <w:szCs w:val="19"/>
               </w:rPr>
-              <w:t xml:space="preserve">A weight deduction (kg) applied before payment.</w:t>
+              <w:t xml:space="preserve">Sending a Lot back for another round of sun drying after its quality check.</w:t>
             </w:r>
           </w:p>
         </w:tc>
@@ -19094,7 +19747,7 @@
                 <w:sz w:val="19"/>
                 <w:szCs w:val="19"/>
               </w:rPr>
-              <w:t xml:space="preserve">Rejection (cut test)</w:t>
+              <w:t xml:space="preserve">Refraction</w:t>
             </w:r>
           </w:p>
         </w:tc>
@@ -19127,7 +19780,7 @@
                 <w:sz w:val="19"/>
                 <w:szCs w:val="19"/>
               </w:rPr>
-              <w:t xml:space="preserve">A kernel that cannot be used.</w:t>
+              <w:t xml:space="preserve">A weight deduction (kg) applied before payment.</w:t>
             </w:r>
           </w:p>
         </w:tc>
@@ -19164,7 +19817,7 @@
                 <w:sz w:val="19"/>
                 <w:szCs w:val="19"/>
               </w:rPr>
-              <w:t xml:space="preserve">Sacs déchirés</w:t>
+              <w:t xml:space="preserve">Rejection (cut test)</w:t>
             </w:r>
           </w:p>
         </w:tc>
@@ -19196,7 +19849,7 @@
                 <w:sz w:val="19"/>
                 <w:szCs w:val="19"/>
               </w:rPr>
-              <w:t xml:space="preserve">Torn bags (French).</w:t>
+              <w:t xml:space="preserve">A kernel that cannot be used.</w:t>
             </w:r>
           </w:p>
         </w:tc>
@@ -19234,7 +19887,7 @@
                 <w:sz w:val="19"/>
                 <w:szCs w:val="19"/>
               </w:rPr>
-              <w:t xml:space="preserve">Shell</w:t>
+              <w:t xml:space="preserve">Sacs déchirés</w:t>
             </w:r>
           </w:p>
         </w:tc>
@@ -19267,7 +19920,7 @@
                 <w:sz w:val="19"/>
                 <w:szCs w:val="19"/>
               </w:rPr>
-              <w:t xml:space="preserve">The hard outer case of the nut; most of its weight.</w:t>
+              <w:t xml:space="preserve">Torn bags (French).</w:t>
             </w:r>
           </w:p>
         </w:tc>
@@ -19304,7 +19957,7 @@
                 <w:sz w:val="19"/>
                 <w:szCs w:val="19"/>
               </w:rPr>
-              <w:t xml:space="preserve">Site</w:t>
+              <w:t xml:space="preserve">Round (drying)</w:t>
             </w:r>
           </w:p>
         </w:tc>
@@ -19336,7 +19989,7 @@
                 <w:sz w:val="19"/>
                 <w:szCs w:val="19"/>
               </w:rPr>
-              <w:t xml:space="preserve">A whole location: Bouaké (BKE) or Yakro Factory (YAK).</w:t>
+              <w:t xml:space="preserve">One pass of sun drying: issue, what came back, quality check (chapter 13).</w:t>
             </w:r>
           </w:p>
         </w:tc>
@@ -19374,7 +20027,7 @@
                 <w:sz w:val="19"/>
                 <w:szCs w:val="19"/>
               </w:rPr>
-              <w:t xml:space="preserve">Spotted</w:t>
+              <w:t xml:space="preserve">Shell</w:t>
             </w:r>
           </w:p>
         </w:tc>
@@ -19407,7 +20060,7 @@
                 <w:sz w:val="19"/>
                 <w:szCs w:val="19"/>
               </w:rPr>
-              <w:t xml:space="preserve">A stained kernel; counts half in KOR.</w:t>
+              <w:t xml:space="preserve">The hard outer case of the nut; most of its weight.</w:t>
             </w:r>
           </w:p>
         </w:tc>
@@ -19444,7 +20097,7 @@
                 <w:sz w:val="19"/>
                 <w:szCs w:val="19"/>
               </w:rPr>
-              <w:t xml:space="preserve">Status</w:t>
+              <w:t xml:space="preserve">Site</w:t>
             </w:r>
           </w:p>
         </w:tc>
@@ -19476,7 +20129,7 @@
                 <w:sz w:val="19"/>
                 <w:szCs w:val="19"/>
               </w:rPr>
-              <w:t xml:space="preserve">Where a truck is in its journey, worked out automatically (chapter 12).</w:t>
+              <w:t xml:space="preserve">A whole location: Bouaké (BKE) or Yakro Factory (YAK).</w:t>
             </w:r>
           </w:p>
         </w:tc>
@@ -19514,7 +20167,7 @@
                 <w:sz w:val="19"/>
                 <w:szCs w:val="19"/>
               </w:rPr>
-              <w:t xml:space="preserve">Store</w:t>
+              <w:t xml:space="preserve">Spotted</w:t>
             </w:r>
           </w:p>
         </w:tc>
@@ -19547,7 +20200,7 @@
                 <w:sz w:val="19"/>
                 <w:szCs w:val="19"/>
               </w:rPr>
-              <w:t xml:space="preserve">A building inside a site (BKE-001/002/003).</w:t>
+              <w:t xml:space="preserve">A stained kernel; counts half in KOR.</w:t>
             </w:r>
           </w:p>
         </w:tc>
@@ -19584,7 +20237,7 @@
                 <w:sz w:val="19"/>
                 <w:szCs w:val="19"/>
               </w:rPr>
-              <w:t xml:space="preserve">Supplier</w:t>
+              <w:t xml:space="preserve">Status</w:t>
             </w:r>
           </w:p>
         </w:tc>
@@ -19616,7 +20269,7 @@
                 <w:sz w:val="19"/>
                 <w:szCs w:val="19"/>
               </w:rPr>
-              <w:t xml:space="preserve">Seller of RCN, identified by an LBA code and a SUP number.</w:t>
+              <w:t xml:space="preserve">Where a truck is in its journey, worked out automatically (chapter 12).</w:t>
             </w:r>
           </w:p>
         </w:tc>
@@ -19654,7 +20307,7 @@
                 <w:sz w:val="19"/>
                 <w:szCs w:val="19"/>
               </w:rPr>
-              <w:t xml:space="preserve">Suspended / Inactive</w:t>
+              <w:t xml:space="preserve">Store</w:t>
             </w:r>
           </w:p>
         </w:tc>
@@ -19687,7 +20340,7 @@
                 <w:sz w:val="19"/>
                 <w:szCs w:val="19"/>
               </w:rPr>
-              <w:t xml:space="preserve">Supplier states: a warning on entry / removed from pickers.</w:t>
+              <w:t xml:space="preserve">A building inside a site (BKE-001/002/003).</w:t>
             </w:r>
           </w:p>
         </w:tc>
@@ -19724,7 +20377,7 @@
                 <w:sz w:val="19"/>
                 <w:szCs w:val="19"/>
               </w:rPr>
-              <w:t xml:space="preserve">Tare</w:t>
+              <w:t xml:space="preserve">Supplier</w:t>
             </w:r>
           </w:p>
         </w:tc>
@@ -19756,7 +20409,7 @@
                 <w:sz w:val="19"/>
                 <w:szCs w:val="19"/>
               </w:rPr>
-              <w:t xml:space="preserve">The weight of the empty truck.</w:t>
+              <w:t xml:space="preserve">Seller of RCN, identified by an LBA code and a SUP number.</w:t>
             </w:r>
           </w:p>
         </w:tc>
@@ -19794,7 +20447,7 @@
                 <w:sz w:val="19"/>
                 <w:szCs w:val="19"/>
               </w:rPr>
-              <w:t xml:space="preserve">Transfer</w:t>
+              <w:t xml:space="preserve">Suspended / Inactive</w:t>
             </w:r>
           </w:p>
         </w:tc>
@@ -19827,7 +20480,7 @@
                 <w:sz w:val="19"/>
                 <w:szCs w:val="19"/>
               </w:rPr>
-              <w:t xml:space="preserve">Moving Lots to another warehouse on one truck (BKT).</w:t>
+              <w:t xml:space="preserve">Supplier states: a warning on entry / removed from pickers.</w:t>
             </w:r>
           </w:p>
         </w:tc>
@@ -19864,7 +20517,7 @@
                 <w:sz w:val="19"/>
                 <w:szCs w:val="19"/>
               </w:rPr>
-              <w:t xml:space="preserve">Unplanned truck</w:t>
+              <w:t xml:space="preserve">Tare</w:t>
             </w:r>
           </w:p>
         </w:tc>
@@ -19896,7 +20549,7 @@
                 <w:sz w:val="19"/>
                 <w:szCs w:val="19"/>
               </w:rPr>
-              <w:t xml:space="preserve">A truck with no delivery plan; allowed, flagged as an exception.</w:t>
+              <w:t xml:space="preserve">The weight of the empty truck, entered in the Weight step with the loaded weight.</w:t>
             </w:r>
           </w:p>
         </w:tc>
@@ -19934,7 +20587,7 @@
                 <w:sz w:val="19"/>
                 <w:szCs w:val="19"/>
               </w:rPr>
-              <w:t xml:space="preserve">Variance</w:t>
+              <w:t xml:space="preserve">Transfer</w:t>
             </w:r>
           </w:p>
         </w:tc>
@@ -19967,7 +20620,7 @@
                 <w:sz w:val="19"/>
                 <w:szCs w:val="19"/>
               </w:rPr>
-              <w:t xml:space="preserve">The difference between what was sent and what arrived (bags, kg).</w:t>
+              <w:t xml:space="preserve">Moving Lots to another warehouse on one truck (BKT).</w:t>
             </w:r>
           </w:p>
         </w:tc>
@@ -20004,7 +20657,7 @@
                 <w:sz w:val="19"/>
                 <w:szCs w:val="19"/>
               </w:rPr>
-              <w:t xml:space="preserve">Void</w:t>
+              <w:t xml:space="preserve">Unplanned truck</w:t>
             </w:r>
           </w:p>
         </w:tc>
@@ -20036,7 +20689,7 @@
                 <w:sz w:val="19"/>
                 <w:szCs w:val="19"/>
               </w:rPr>
-              <w:t xml:space="preserve">A shell with nothing inside (cut test).</w:t>
+              <w:t xml:space="preserve">A truck with no delivery plan; allowed, flagged as an exception.</w:t>
             </w:r>
           </w:p>
         </w:tc>
@@ -20074,6 +20727,146 @@
                 <w:sz w:val="19"/>
                 <w:szCs w:val="19"/>
               </w:rPr>
+              <w:t xml:space="preserve">Variance</w:t>
+            </w:r>
+          </w:p>
+        </w:tc>
+        <w:tc>
+          <w:tcPr>
+            <w:tcW w:type="dxa" w:w="7068"/>
+            <w:tcBorders>
+              <w:top w:val="single" w:color="D6D3D1" w:sz="4"/>
+              <w:left w:val="single" w:color="D6D3D1" w:sz="4"/>
+              <w:bottom w:val="single" w:color="D6D3D1" w:sz="4"/>
+              <w:right w:val="single" w:color="D6D3D1" w:sz="4"/>
+            </w:tcBorders>
+            <w:shd w:fill="F5F5F4" w:color="auto" w:val="clear"/>
+            <w:tcMar>
+              <w:top w:type="dxa" w:w="70"/>
+              <w:left w:type="dxa" w:w="110"/>
+              <w:bottom w:type="dxa" w:w="70"/>
+              <w:right w:type="dxa" w:w="110"/>
+            </w:tcMar>
+            <w:vAlign w:val="top"/>
+          </w:tcPr>
+          <w:p>
+            <w:pPr>
+              <w:spacing w:after="40" w:line="264"/>
+            </w:pPr>
+            <w:r>
+              <w:rPr>
+                <w:b w:val="false"/>
+                <w:bCs w:val="false"/>
+                <w:sz w:val="19"/>
+                <w:szCs w:val="19"/>
+              </w:rPr>
+              <w:t xml:space="preserve">The difference between what was sent and what arrived (bags, kg).</w:t>
+            </w:r>
+          </w:p>
+        </w:tc>
+      </w:tr>
+      <w:tr>
+        <w:trPr>
+          <w:cantSplit/>
+        </w:trPr>
+        <w:tc>
+          <w:tcPr>
+            <w:tcW w:type="dxa" w:w="2570"/>
+            <w:tcBorders>
+              <w:top w:val="single" w:color="D6D3D1" w:sz="4"/>
+              <w:left w:val="single" w:color="D6D3D1" w:sz="4"/>
+              <w:bottom w:val="single" w:color="D6D3D1" w:sz="4"/>
+              <w:right w:val="single" w:color="D6D3D1" w:sz="4"/>
+            </w:tcBorders>
+            <w:tcMar>
+              <w:top w:type="dxa" w:w="70"/>
+              <w:left w:type="dxa" w:w="110"/>
+              <w:bottom w:type="dxa" w:w="70"/>
+              <w:right w:type="dxa" w:w="110"/>
+            </w:tcMar>
+            <w:vAlign w:val="top"/>
+          </w:tcPr>
+          <w:p>
+            <w:pPr>
+              <w:spacing w:after="40" w:line="264"/>
+            </w:pPr>
+            <w:r>
+              <w:rPr>
+                <w:b/>
+                <w:bCs/>
+                <w:sz w:val="19"/>
+                <w:szCs w:val="19"/>
+              </w:rPr>
+              <w:t xml:space="preserve">Void</w:t>
+            </w:r>
+          </w:p>
+        </w:tc>
+        <w:tc>
+          <w:tcPr>
+            <w:tcW w:type="dxa" w:w="7068"/>
+            <w:tcBorders>
+              <w:top w:val="single" w:color="D6D3D1" w:sz="4"/>
+              <w:left w:val="single" w:color="D6D3D1" w:sz="4"/>
+              <w:bottom w:val="single" w:color="D6D3D1" w:sz="4"/>
+              <w:right w:val="single" w:color="D6D3D1" w:sz="4"/>
+            </w:tcBorders>
+            <w:tcMar>
+              <w:top w:type="dxa" w:w="70"/>
+              <w:left w:type="dxa" w:w="110"/>
+              <w:bottom w:type="dxa" w:w="70"/>
+              <w:right w:type="dxa" w:w="110"/>
+            </w:tcMar>
+            <w:vAlign w:val="top"/>
+          </w:tcPr>
+          <w:p>
+            <w:pPr>
+              <w:spacing w:after="40" w:line="264"/>
+            </w:pPr>
+            <w:r>
+              <w:rPr>
+                <w:b w:val="false"/>
+                <w:bCs w:val="false"/>
+                <w:sz w:val="19"/>
+                <w:szCs w:val="19"/>
+              </w:rPr>
+              <w:t xml:space="preserve">A shell with nothing inside (cut test).</w:t>
+            </w:r>
+          </w:p>
+        </w:tc>
+      </w:tr>
+      <w:tr>
+        <w:trPr>
+          <w:cantSplit/>
+        </w:trPr>
+        <w:tc>
+          <w:tcPr>
+            <w:tcW w:type="dxa" w:w="2570"/>
+            <w:tcBorders>
+              <w:top w:val="single" w:color="D6D3D1" w:sz="4"/>
+              <w:left w:val="single" w:color="D6D3D1" w:sz="4"/>
+              <w:bottom w:val="single" w:color="D6D3D1" w:sz="4"/>
+              <w:right w:val="single" w:color="D6D3D1" w:sz="4"/>
+            </w:tcBorders>
+            <w:shd w:fill="F5F5F4" w:color="auto" w:val="clear"/>
+            <w:tcMar>
+              <w:top w:type="dxa" w:w="70"/>
+              <w:left w:type="dxa" w:w="110"/>
+              <w:bottom w:type="dxa" w:w="70"/>
+              <w:right w:type="dxa" w:w="110"/>
+            </w:tcMar>
+            <w:vAlign w:val="top"/>
+          </w:tcPr>
+          <w:p>
+            <w:pPr>
+              <w:spacing w:after="40" w:line="264"/>
+            </w:pPr>
+            <w:r>
+              <w:rPr>
+                <w:b/>
+                <w:bCs/>
+                <w:sz w:val="19"/>
+                <w:szCs w:val="19"/>
+              </w:rPr>
               <w:t xml:space="preserve">Warehouse Incharge</w:t>
             </w:r>
           </w:p>
@@ -20107,7 +20900,7 @@
                 <w:sz w:val="19"/>
                 <w:szCs w:val="19"/>
               </w:rPr>
-              <w:t xml:space="preserve">Role that manages one warehouse: edits directly, approves, decides Pass/Fail.</w:t>
+              <w:t xml:space="preserve">Role that manages one warehouse: edits directly, approves, decides Pass/Fail. Does not see prices or amounts.</w:t>
             </w:r>
           </w:p>
         </w:tc>

</xml_diff>